<commit_message>
Add IETF standards corpus, RFC-aware chunking, scoped retrieval, Markdown answers
</commit_message>
<xml_diff>
--- a/docs/DemoQuestions_ACME Widget API 14.docx
+++ b/docs/DemoQuestions_ACME Widget API 14.docx
@@ -24,9 +24,98 @@
     </w:p>
     <w:p>
       <w:r>
+        <w:drawing>
+          <wp:inline distT="0" distB="0" distL="0" distR="0" wp14:anchorId="5AF10EE9" wp14:editId="49B98D5D">
+            <wp:extent cx="5731510" cy="2903855"/>
+            <wp:effectExtent l="19050" t="19050" r="21590" b="10795"/>
+            <wp:docPr id="554270860" name="Picture 1"/>
+            <wp:cNvGraphicFramePr>
+              <a:graphicFrameLocks xmlns:a="http://schemas.openxmlformats.org/drawingml/2006/main" noChangeAspect="1"/>
+            </wp:cNvGraphicFramePr>
+            <a:graphic xmlns:a="http://schemas.openxmlformats.org/drawingml/2006/main">
+              <a:graphicData uri="http://schemas.openxmlformats.org/drawingml/2006/picture">
+                <pic:pic xmlns:pic="http://schemas.openxmlformats.org/drawingml/2006/picture">
+                  <pic:nvPicPr>
+                    <pic:cNvPr id="554270860" name=""/>
+                    <pic:cNvPicPr/>
+                  </pic:nvPicPr>
+                  <pic:blipFill>
+                    <a:blip r:embed="rId4"/>
+                    <a:stretch>
+                      <a:fillRect/>
+                    </a:stretch>
+                  </pic:blipFill>
+                  <pic:spPr>
+                    <a:xfrm>
+                      <a:off x="0" y="0"/>
+                      <a:ext cx="5731510" cy="2903855"/>
+                    </a:xfrm>
+                    <a:prstGeom prst="rect">
+                      <a:avLst/>
+                    </a:prstGeom>
+                    <a:ln>
+                      <a:solidFill>
+                        <a:schemeClr val="accent1"/>
+                      </a:solidFill>
+                    </a:ln>
+                  </pic:spPr>
+                </pic:pic>
+              </a:graphicData>
+            </a:graphic>
+          </wp:inline>
+        </w:drawing>
+      </w:r>
+    </w:p>
+    <w:p>
+      <w:r>
+        <w:drawing>
+          <wp:inline distT="0" distB="0" distL="0" distR="0" wp14:anchorId="0DBD464A" wp14:editId="168B4587">
+            <wp:extent cx="5731510" cy="3060065"/>
+            <wp:effectExtent l="19050" t="19050" r="21590" b="26035"/>
+            <wp:docPr id="1736890840" name="Picture 1"/>
+            <wp:cNvGraphicFramePr>
+              <a:graphicFrameLocks xmlns:a="http://schemas.openxmlformats.org/drawingml/2006/main" noChangeAspect="1"/>
+            </wp:cNvGraphicFramePr>
+            <a:graphic xmlns:a="http://schemas.openxmlformats.org/drawingml/2006/main">
+              <a:graphicData uri="http://schemas.openxmlformats.org/drawingml/2006/picture">
+                <pic:pic xmlns:pic="http://schemas.openxmlformats.org/drawingml/2006/picture">
+                  <pic:nvPicPr>
+                    <pic:cNvPr id="1736890840" name=""/>
+                    <pic:cNvPicPr/>
+                  </pic:nvPicPr>
+                  <pic:blipFill>
+                    <a:blip r:embed="rId5"/>
+                    <a:stretch>
+                      <a:fillRect/>
+                    </a:stretch>
+                  </pic:blipFill>
+                  <pic:spPr>
+                    <a:xfrm>
+                      <a:off x="0" y="0"/>
+                      <a:ext cx="5731510" cy="3060065"/>
+                    </a:xfrm>
+                    <a:prstGeom prst="rect">
+                      <a:avLst/>
+                    </a:prstGeom>
+                    <a:ln>
+                      <a:solidFill>
+                        <a:schemeClr val="accent1"/>
+                      </a:solidFill>
+                    </a:ln>
+                  </pic:spPr>
+                </pic:pic>
+              </a:graphicData>
+            </a:graphic>
+          </wp:inline>
+        </w:drawing>
+      </w:r>
+    </w:p>
+    <w:p>
+      <w:r>
         <w:rPr>
           <w:noProof/>
         </w:rPr>
+        <w:lastRenderedPageBreak/>
         <w:drawing>
           <wp:inline distT="0" distB="0" distL="0" distR="0" wp14:anchorId="753D2BB0" wp14:editId="1248E2D4">
             <wp:extent cx="5731510" cy="2559050"/>
@@ -43,7 +132,7 @@
                     <pic:cNvPicPr/>
                   </pic:nvPicPr>
                   <pic:blipFill>
-                    <a:blip r:embed="rId4"/>
+                    <a:blip r:embed="rId6"/>
                     <a:stretch>
                       <a:fillRect/>
                     </a:stretch>
@@ -87,7 +176,7 @@
                     <pic:cNvPicPr/>
                   </pic:nvPicPr>
                   <pic:blipFill>
-                    <a:blip r:embed="rId5"/>
+                    <a:blip r:embed="rId7"/>
                     <a:stretch>
                       <a:fillRect/>
                     </a:stretch>
@@ -132,7 +221,7 @@
                     <pic:cNvPicPr/>
                   </pic:nvPicPr>
                   <pic:blipFill>
-                    <a:blip r:embed="rId6"/>
+                    <a:blip r:embed="rId8"/>
                     <a:stretch>
                       <a:fillRect/>
                     </a:stretch>
@@ -176,7 +265,7 @@
                     <pic:cNvPicPr/>
                   </pic:nvPicPr>
                   <pic:blipFill>
-                    <a:blip r:embed="rId7"/>
+                    <a:blip r:embed="rId9"/>
                     <a:stretch>
                       <a:fillRect/>
                     </a:stretch>
@@ -221,7 +310,7 @@
                     <pic:cNvPicPr/>
                   </pic:nvPicPr>
                   <pic:blipFill>
-                    <a:blip r:embed="rId8"/>
+                    <a:blip r:embed="rId10"/>
                     <a:stretch>
                       <a:fillRect/>
                     </a:stretch>
@@ -274,7 +363,7 @@
                     <pic:cNvPicPr/>
                   </pic:nvPicPr>
                   <pic:blipFill>
-                    <a:blip r:embed="rId9"/>
+                    <a:blip r:embed="rId11"/>
                     <a:stretch>
                       <a:fillRect/>
                     </a:stretch>
@@ -322,7 +411,7 @@
                     <pic:cNvPicPr/>
                   </pic:nvPicPr>
                   <pic:blipFill>
-                    <a:blip r:embed="rId10"/>
+                    <a:blip r:embed="rId12"/>
                     <a:stretch>
                       <a:fillRect/>
                     </a:stretch>
@@ -369,7 +458,7 @@
                     <pic:cNvPicPr/>
                   </pic:nvPicPr>
                   <pic:blipFill>
-                    <a:blip r:embed="rId11"/>
+                    <a:blip r:embed="rId13"/>
                     <a:stretch>
                       <a:fillRect/>
                     </a:stretch>

</xml_diff>